<commit_message>
feat(ui): redesign CRM frontend with responsive layouts and improved UX
</commit_message>
<xml_diff>
--- a/generated_proposals/Proposal_1.docx
+++ b/generated_proposals/Proposal_1.docx
@@ -5,6 +5,7 @@
     <w:p>
       <w:pPr>
         <w:spacing w:before="17"/>
+        <w:ind w:left="39"/>
         <w:rPr>
           <w:rFonts w:ascii="Arial"/>
           <w:b/>
@@ -18,6 +19,7 @@
           <w:rFonts w:ascii="Verdana"/>
           <w:noProof/>
           <w:sz w:val="15"/>
+          <w:lang w:val="en-IN" w:eastAsia="en-IN"/>
         </w:rPr>
         <mc:AlternateContent>
           <mc:Choice Requires="wpg">
@@ -269,7 +271,7 @@
           </mc:Choice>
           <mc:Fallback>
             <w:pict>
-              <v:group w14:anchorId="73479AD3" id="Group 3" o:spid="_x0000_s1026" style="position:absolute;margin-left:0;margin-top:0;width:595.5pt;height:842.2pt;z-index:-251680768;mso-wrap-distance-left:0;mso-wrap-distance-right:0;mso-position-horizontal-relative:page;mso-position-vertical-relative:page;mso-height-relative:margin" coordsize="75628,106961" o:gfxdata="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">
+              <v:group w14:anchorId="24C8724F" id="Group 3" o:spid="_x0000_s1026" style="position:absolute;margin-left:0;margin-top:0;width:595.5pt;height:842.2pt;z-index:-251680768;mso-wrap-distance-left:0;mso-wrap-distance-right:0;mso-position-horizontal-relative:page;mso-position-vertical-relative:page;mso-height-relative:margin" coordsize="75628,106961" o:gfxdata="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